<commit_message>
P04 : Perbaikan file penilaian teman
</commit_message>
<xml_diff>
--- a/p04-layout-manager/Penilaian Teman_Siti Ekarina Septianor.docx
+++ b/p04-layout-manager/Penilaian Teman_Siti Ekarina Septianor.docx
@@ -53,6 +53,7 @@
                 <w:bCs/>
               </w:rPr>
             </w:pPr>
+            <w:proofErr w:type="spellStart"/>
             <w:r>
               <w:rPr>
                 <w:rFonts w:ascii="Times New Roman" w:hAnsi="Times New Roman" w:cs="Times New Roman"/>
@@ -61,6 +62,7 @@
               </w:rPr>
               <w:t>Pemeriksaan</w:t>
             </w:r>
+            <w:proofErr w:type="spellEnd"/>
           </w:p>
         </w:tc>
         <w:tc>
@@ -82,7 +84,25 @@
                 <w:b/>
                 <w:bCs/>
               </w:rPr>
-              <w:t>Ya atau Belum</w:t>
+              <w:t xml:space="preserve">Ya </w:t>
+            </w:r>
+            <w:proofErr w:type="spellStart"/>
+            <w:r>
+              <w:rPr>
+                <w:rFonts w:ascii="Times New Roman" w:hAnsi="Times New Roman" w:cs="Times New Roman"/>
+                <w:b/>
+                <w:bCs/>
+              </w:rPr>
+              <w:t>atau</w:t>
+            </w:r>
+            <w:proofErr w:type="spellEnd"/>
+            <w:r>
+              <w:rPr>
+                <w:rFonts w:ascii="Times New Roman" w:hAnsi="Times New Roman" w:cs="Times New Roman"/>
+                <w:b/>
+                <w:bCs/>
+              </w:rPr>
+              <w:t xml:space="preserve"> Belum</w:t>
             </w:r>
           </w:p>
         </w:tc>
@@ -124,8 +144,44 @@
               <w:rPr>
                 <w:rFonts w:ascii="Times New Roman" w:hAnsi="Times New Roman" w:cs="Times New Roman"/>
               </w:rPr>
-              <w:t>Label singkat, jelas, dan sejajar</w:t>
-            </w:r>
+              <w:t xml:space="preserve">Label </w:t>
+            </w:r>
+            <w:proofErr w:type="spellStart"/>
+            <w:r>
+              <w:rPr>
+                <w:rFonts w:ascii="Times New Roman" w:hAnsi="Times New Roman" w:cs="Times New Roman"/>
+              </w:rPr>
+              <w:t>singkat</w:t>
+            </w:r>
+            <w:proofErr w:type="spellEnd"/>
+            <w:r>
+              <w:rPr>
+                <w:rFonts w:ascii="Times New Roman" w:hAnsi="Times New Roman" w:cs="Times New Roman"/>
+              </w:rPr>
+              <w:t xml:space="preserve">, </w:t>
+            </w:r>
+            <w:proofErr w:type="spellStart"/>
+            <w:r>
+              <w:rPr>
+                <w:rFonts w:ascii="Times New Roman" w:hAnsi="Times New Roman" w:cs="Times New Roman"/>
+              </w:rPr>
+              <w:t>jelas</w:t>
+            </w:r>
+            <w:proofErr w:type="spellEnd"/>
+            <w:r>
+              <w:rPr>
+                <w:rFonts w:ascii="Times New Roman" w:hAnsi="Times New Roman" w:cs="Times New Roman"/>
+              </w:rPr>
+              <w:t xml:space="preserve">, dan </w:t>
+            </w:r>
+            <w:proofErr w:type="spellStart"/>
+            <w:r>
+              <w:rPr>
+                <w:rFonts w:ascii="Times New Roman" w:hAnsi="Times New Roman" w:cs="Times New Roman"/>
+              </w:rPr>
+              <w:t>sejajar</w:t>
+            </w:r>
+            <w:proofErr w:type="spellEnd"/>
           </w:p>
         </w:tc>
         <w:tc>
@@ -180,12 +236,70 @@
                 <w:rFonts w:ascii="Times New Roman" w:hAnsi="Times New Roman" w:cs="Times New Roman"/>
               </w:rPr>
             </w:pPr>
-            <w:r>
-              <w:rPr>
-                <w:rFonts w:ascii="Times New Roman" w:hAnsi="Times New Roman" w:cs="Times New Roman"/>
-              </w:rPr>
-              <w:t>Isian dikelompokkan dengan judul bagian</w:t>
-            </w:r>
+            <w:proofErr w:type="spellStart"/>
+            <w:r>
+              <w:rPr>
+                <w:rFonts w:ascii="Times New Roman" w:hAnsi="Times New Roman" w:cs="Times New Roman"/>
+              </w:rPr>
+              <w:t>Isian</w:t>
+            </w:r>
+            <w:proofErr w:type="spellEnd"/>
+            <w:r>
+              <w:rPr>
+                <w:rFonts w:ascii="Times New Roman" w:hAnsi="Times New Roman" w:cs="Times New Roman"/>
+              </w:rPr>
+              <w:t xml:space="preserve"> </w:t>
+            </w:r>
+            <w:proofErr w:type="spellStart"/>
+            <w:r>
+              <w:rPr>
+                <w:rFonts w:ascii="Times New Roman" w:hAnsi="Times New Roman" w:cs="Times New Roman"/>
+              </w:rPr>
+              <w:t>dikelompokkan</w:t>
+            </w:r>
+            <w:proofErr w:type="spellEnd"/>
+            <w:r>
+              <w:rPr>
+                <w:rFonts w:ascii="Times New Roman" w:hAnsi="Times New Roman" w:cs="Times New Roman"/>
+              </w:rPr>
+              <w:t xml:space="preserve"> </w:t>
+            </w:r>
+            <w:proofErr w:type="spellStart"/>
+            <w:r>
+              <w:rPr>
+                <w:rFonts w:ascii="Times New Roman" w:hAnsi="Times New Roman" w:cs="Times New Roman"/>
+              </w:rPr>
+              <w:t>dengan</w:t>
+            </w:r>
+            <w:proofErr w:type="spellEnd"/>
+            <w:r>
+              <w:rPr>
+                <w:rFonts w:ascii="Times New Roman" w:hAnsi="Times New Roman" w:cs="Times New Roman"/>
+              </w:rPr>
+              <w:t xml:space="preserve"> </w:t>
+            </w:r>
+            <w:proofErr w:type="spellStart"/>
+            <w:r>
+              <w:rPr>
+                <w:rFonts w:ascii="Times New Roman" w:hAnsi="Times New Roman" w:cs="Times New Roman"/>
+              </w:rPr>
+              <w:t>judul</w:t>
+            </w:r>
+            <w:proofErr w:type="spellEnd"/>
+            <w:r>
+              <w:rPr>
+                <w:rFonts w:ascii="Times New Roman" w:hAnsi="Times New Roman" w:cs="Times New Roman"/>
+              </w:rPr>
+              <w:t xml:space="preserve"> </w:t>
+            </w:r>
+            <w:proofErr w:type="spellStart"/>
+            <w:r>
+              <w:rPr>
+                <w:rFonts w:ascii="Times New Roman" w:hAnsi="Times New Roman" w:cs="Times New Roman"/>
+              </w:rPr>
+              <w:t>bagian</w:t>
+            </w:r>
+            <w:proofErr w:type="spellEnd"/>
           </w:p>
         </w:tc>
         <w:tc>
@@ -244,7 +358,49 @@
               <w:rPr>
                 <w:rFonts w:ascii="Times New Roman" w:hAnsi="Times New Roman" w:cs="Times New Roman"/>
               </w:rPr>
-              <w:t>Placeholder dipakai untuk isian yang punya format</w:t>
+              <w:t xml:space="preserve">Placeholder </w:t>
+            </w:r>
+            <w:proofErr w:type="spellStart"/>
+            <w:r>
+              <w:rPr>
+                <w:rFonts w:ascii="Times New Roman" w:hAnsi="Times New Roman" w:cs="Times New Roman"/>
+              </w:rPr>
+              <w:t>dipakai</w:t>
+            </w:r>
+            <w:proofErr w:type="spellEnd"/>
+            <w:r>
+              <w:rPr>
+                <w:rFonts w:ascii="Times New Roman" w:hAnsi="Times New Roman" w:cs="Times New Roman"/>
+              </w:rPr>
+              <w:t xml:space="preserve"> </w:t>
+            </w:r>
+            <w:proofErr w:type="spellStart"/>
+            <w:r>
+              <w:rPr>
+                <w:rFonts w:ascii="Times New Roman" w:hAnsi="Times New Roman" w:cs="Times New Roman"/>
+              </w:rPr>
+              <w:t>untuk</w:t>
+            </w:r>
+            <w:proofErr w:type="spellEnd"/>
+            <w:r>
+              <w:rPr>
+                <w:rFonts w:ascii="Times New Roman" w:hAnsi="Times New Roman" w:cs="Times New Roman"/>
+              </w:rPr>
+              <w:t xml:space="preserve"> </w:t>
+            </w:r>
+            <w:proofErr w:type="spellStart"/>
+            <w:r>
+              <w:rPr>
+                <w:rFonts w:ascii="Times New Roman" w:hAnsi="Times New Roman" w:cs="Times New Roman"/>
+              </w:rPr>
+              <w:t>isian</w:t>
+            </w:r>
+            <w:proofErr w:type="spellEnd"/>
+            <w:r>
+              <w:rPr>
+                <w:rFonts w:ascii="Times New Roman" w:hAnsi="Times New Roman" w:cs="Times New Roman"/>
+              </w:rPr>
+              <w:t xml:space="preserve"> yang punya format</w:t>
             </w:r>
           </w:p>
         </w:tc>
@@ -300,11 +456,47 @@
                 <w:rFonts w:ascii="Times New Roman" w:hAnsi="Times New Roman" w:cs="Times New Roman"/>
               </w:rPr>
             </w:pPr>
-            <w:r>
-              <w:rPr>
-                <w:rFonts w:ascii="Times New Roman" w:hAnsi="Times New Roman" w:cs="Times New Roman"/>
-              </w:rPr>
-              <w:t>Komponen sesuai jenis data</w:t>
+            <w:proofErr w:type="spellStart"/>
+            <w:r>
+              <w:rPr>
+                <w:rFonts w:ascii="Times New Roman" w:hAnsi="Times New Roman" w:cs="Times New Roman"/>
+              </w:rPr>
+              <w:t>Komponen</w:t>
+            </w:r>
+            <w:proofErr w:type="spellEnd"/>
+            <w:r>
+              <w:rPr>
+                <w:rFonts w:ascii="Times New Roman" w:hAnsi="Times New Roman" w:cs="Times New Roman"/>
+              </w:rPr>
+              <w:t xml:space="preserve"> </w:t>
+            </w:r>
+            <w:proofErr w:type="spellStart"/>
+            <w:r>
+              <w:rPr>
+                <w:rFonts w:ascii="Times New Roman" w:hAnsi="Times New Roman" w:cs="Times New Roman"/>
+              </w:rPr>
+              <w:t>sesuai</w:t>
+            </w:r>
+            <w:proofErr w:type="spellEnd"/>
+            <w:r>
+              <w:rPr>
+                <w:rFonts w:ascii="Times New Roman" w:hAnsi="Times New Roman" w:cs="Times New Roman"/>
+              </w:rPr>
+              <w:t xml:space="preserve"> </w:t>
+            </w:r>
+            <w:proofErr w:type="spellStart"/>
+            <w:r>
+              <w:rPr>
+                <w:rFonts w:ascii="Times New Roman" w:hAnsi="Times New Roman" w:cs="Times New Roman"/>
+              </w:rPr>
+              <w:t>jenis</w:t>
+            </w:r>
+            <w:proofErr w:type="spellEnd"/>
+            <w:r>
+              <w:rPr>
+                <w:rFonts w:ascii="Times New Roman" w:hAnsi="Times New Roman" w:cs="Times New Roman"/>
+              </w:rPr>
+              <w:t xml:space="preserve"> data</w:t>
             </w:r>
           </w:p>
         </w:tc>
@@ -360,12 +552,84 @@
                 <w:rFonts w:ascii="Times New Roman" w:hAnsi="Times New Roman" w:cs="Times New Roman"/>
               </w:rPr>
             </w:pPr>
-            <w:r>
-              <w:rPr>
-                <w:rFonts w:ascii="Times New Roman" w:hAnsi="Times New Roman" w:cs="Times New Roman"/>
-              </w:rPr>
-              <w:t>Tombol utama menonjol dan berada di kanan bawah</w:t>
-            </w:r>
+            <w:proofErr w:type="spellStart"/>
+            <w:r>
+              <w:rPr>
+                <w:rFonts w:ascii="Times New Roman" w:hAnsi="Times New Roman" w:cs="Times New Roman"/>
+              </w:rPr>
+              <w:t>Tombol</w:t>
+            </w:r>
+            <w:proofErr w:type="spellEnd"/>
+            <w:r>
+              <w:rPr>
+                <w:rFonts w:ascii="Times New Roman" w:hAnsi="Times New Roman" w:cs="Times New Roman"/>
+              </w:rPr>
+              <w:t xml:space="preserve"> </w:t>
+            </w:r>
+            <w:proofErr w:type="spellStart"/>
+            <w:r>
+              <w:rPr>
+                <w:rFonts w:ascii="Times New Roman" w:hAnsi="Times New Roman" w:cs="Times New Roman"/>
+              </w:rPr>
+              <w:t>utama</w:t>
+            </w:r>
+            <w:proofErr w:type="spellEnd"/>
+            <w:r>
+              <w:rPr>
+                <w:rFonts w:ascii="Times New Roman" w:hAnsi="Times New Roman" w:cs="Times New Roman"/>
+              </w:rPr>
+              <w:t xml:space="preserve"> </w:t>
+            </w:r>
+            <w:proofErr w:type="spellStart"/>
+            <w:r>
+              <w:rPr>
+                <w:rFonts w:ascii="Times New Roman" w:hAnsi="Times New Roman" w:cs="Times New Roman"/>
+              </w:rPr>
+              <w:t>menonjol</w:t>
+            </w:r>
+            <w:proofErr w:type="spellEnd"/>
+            <w:r>
+              <w:rPr>
+                <w:rFonts w:ascii="Times New Roman" w:hAnsi="Times New Roman" w:cs="Times New Roman"/>
+              </w:rPr>
+              <w:t xml:space="preserve"> dan </w:t>
+            </w:r>
+            <w:proofErr w:type="spellStart"/>
+            <w:r>
+              <w:rPr>
+                <w:rFonts w:ascii="Times New Roman" w:hAnsi="Times New Roman" w:cs="Times New Roman"/>
+              </w:rPr>
+              <w:t>berada</w:t>
+            </w:r>
+            <w:proofErr w:type="spellEnd"/>
+            <w:r>
+              <w:rPr>
+                <w:rFonts w:ascii="Times New Roman" w:hAnsi="Times New Roman" w:cs="Times New Roman"/>
+              </w:rPr>
+              <w:t xml:space="preserve"> di </w:t>
+            </w:r>
+            <w:proofErr w:type="spellStart"/>
+            <w:r>
+              <w:rPr>
+                <w:rFonts w:ascii="Times New Roman" w:hAnsi="Times New Roman" w:cs="Times New Roman"/>
+              </w:rPr>
+              <w:t>kanan</w:t>
+            </w:r>
+            <w:proofErr w:type="spellEnd"/>
+            <w:r>
+              <w:rPr>
+                <w:rFonts w:ascii="Times New Roman" w:hAnsi="Times New Roman" w:cs="Times New Roman"/>
+              </w:rPr>
+              <w:t xml:space="preserve"> </w:t>
+            </w:r>
+            <w:proofErr w:type="spellStart"/>
+            <w:r>
+              <w:rPr>
+                <w:rFonts w:ascii="Times New Roman" w:hAnsi="Times New Roman" w:cs="Times New Roman"/>
+              </w:rPr>
+              <w:t>bawah</w:t>
+            </w:r>
+            <w:proofErr w:type="spellEnd"/>
           </w:p>
         </w:tc>
         <w:tc>
@@ -424,8 +688,44 @@
               <w:rPr>
                 <w:rFonts w:ascii="Times New Roman" w:hAnsi="Times New Roman" w:cs="Times New Roman"/>
               </w:rPr>
-              <w:t>Jarak antar komponen konsisten</w:t>
-            </w:r>
+              <w:t xml:space="preserve">Jarak </w:t>
+            </w:r>
+            <w:proofErr w:type="spellStart"/>
+            <w:r>
+              <w:rPr>
+                <w:rFonts w:ascii="Times New Roman" w:hAnsi="Times New Roman" w:cs="Times New Roman"/>
+              </w:rPr>
+              <w:t>antar</w:t>
+            </w:r>
+            <w:proofErr w:type="spellEnd"/>
+            <w:r>
+              <w:rPr>
+                <w:rFonts w:ascii="Times New Roman" w:hAnsi="Times New Roman" w:cs="Times New Roman"/>
+              </w:rPr>
+              <w:t xml:space="preserve"> </w:t>
+            </w:r>
+            <w:proofErr w:type="spellStart"/>
+            <w:r>
+              <w:rPr>
+                <w:rFonts w:ascii="Times New Roman" w:hAnsi="Times New Roman" w:cs="Times New Roman"/>
+              </w:rPr>
+              <w:t>komponen</w:t>
+            </w:r>
+            <w:proofErr w:type="spellEnd"/>
+            <w:r>
+              <w:rPr>
+                <w:rFonts w:ascii="Times New Roman" w:hAnsi="Times New Roman" w:cs="Times New Roman"/>
+              </w:rPr>
+              <w:t xml:space="preserve"> </w:t>
+            </w:r>
+            <w:proofErr w:type="spellStart"/>
+            <w:r>
+              <w:rPr>
+                <w:rFonts w:ascii="Times New Roman" w:hAnsi="Times New Roman" w:cs="Times New Roman"/>
+              </w:rPr>
+              <w:t>konsisten</w:t>
+            </w:r>
+            <w:proofErr w:type="spellEnd"/>
           </w:p>
         </w:tc>
         <w:tc>
@@ -484,8 +784,86 @@
               <w:rPr>
                 <w:rFonts w:ascii="Times New Roman" w:hAnsi="Times New Roman" w:cs="Times New Roman"/>
               </w:rPr>
-              <w:t>Form tetap rapi saat jendela dilebarkan dan ditinggikan</w:t>
-            </w:r>
+              <w:t xml:space="preserve">Form </w:t>
+            </w:r>
+            <w:proofErr w:type="spellStart"/>
+            <w:r>
+              <w:rPr>
+                <w:rFonts w:ascii="Times New Roman" w:hAnsi="Times New Roman" w:cs="Times New Roman"/>
+              </w:rPr>
+              <w:t>tetap</w:t>
+            </w:r>
+            <w:proofErr w:type="spellEnd"/>
+            <w:r>
+              <w:rPr>
+                <w:rFonts w:ascii="Times New Roman" w:hAnsi="Times New Roman" w:cs="Times New Roman"/>
+              </w:rPr>
+              <w:t xml:space="preserve"> </w:t>
+            </w:r>
+            <w:proofErr w:type="spellStart"/>
+            <w:r>
+              <w:rPr>
+                <w:rFonts w:ascii="Times New Roman" w:hAnsi="Times New Roman" w:cs="Times New Roman"/>
+              </w:rPr>
+              <w:t>rapi</w:t>
+            </w:r>
+            <w:proofErr w:type="spellEnd"/>
+            <w:r>
+              <w:rPr>
+                <w:rFonts w:ascii="Times New Roman" w:hAnsi="Times New Roman" w:cs="Times New Roman"/>
+              </w:rPr>
+              <w:t xml:space="preserve"> </w:t>
+            </w:r>
+            <w:proofErr w:type="spellStart"/>
+            <w:r>
+              <w:rPr>
+                <w:rFonts w:ascii="Times New Roman" w:hAnsi="Times New Roman" w:cs="Times New Roman"/>
+              </w:rPr>
+              <w:t>saat</w:t>
+            </w:r>
+            <w:proofErr w:type="spellEnd"/>
+            <w:r>
+              <w:rPr>
+                <w:rFonts w:ascii="Times New Roman" w:hAnsi="Times New Roman" w:cs="Times New Roman"/>
+              </w:rPr>
+              <w:t xml:space="preserve"> </w:t>
+            </w:r>
+            <w:proofErr w:type="spellStart"/>
+            <w:r>
+              <w:rPr>
+                <w:rFonts w:ascii="Times New Roman" w:hAnsi="Times New Roman" w:cs="Times New Roman"/>
+              </w:rPr>
+              <w:t>jendela</w:t>
+            </w:r>
+            <w:proofErr w:type="spellEnd"/>
+            <w:r>
+              <w:rPr>
+                <w:rFonts w:ascii="Times New Roman" w:hAnsi="Times New Roman" w:cs="Times New Roman"/>
+              </w:rPr>
+              <w:t xml:space="preserve"> </w:t>
+            </w:r>
+            <w:proofErr w:type="spellStart"/>
+            <w:r>
+              <w:rPr>
+                <w:rFonts w:ascii="Times New Roman" w:hAnsi="Times New Roman" w:cs="Times New Roman"/>
+              </w:rPr>
+              <w:t>dilebarkan</w:t>
+            </w:r>
+            <w:proofErr w:type="spellEnd"/>
+            <w:r>
+              <w:rPr>
+                <w:rFonts w:ascii="Times New Roman" w:hAnsi="Times New Roman" w:cs="Times New Roman"/>
+              </w:rPr>
+              <w:t xml:space="preserve"> dan </w:t>
+            </w:r>
+            <w:proofErr w:type="spellStart"/>
+            <w:r>
+              <w:rPr>
+                <w:rFonts w:ascii="Times New Roman" w:hAnsi="Times New Roman" w:cs="Times New Roman"/>
+              </w:rPr>
+              <w:t>ditinggikan</w:t>
+            </w:r>
+            <w:proofErr w:type="spellEnd"/>
           </w:p>
         </w:tc>
         <w:tc>
@@ -540,24 +918,102 @@
                 <w:rFonts w:ascii="Times New Roman" w:hAnsi="Times New Roman" w:cs="Times New Roman"/>
               </w:rPr>
             </w:pPr>
-            <w:r>
-              <w:rPr>
-                <w:rFonts w:ascii="Times New Roman" w:hAnsi="Times New Roman" w:cs="Times New Roman"/>
-              </w:rPr>
-              <w:t>Tampilan dibuat dengan JFrame Form dan layout manager, bukan Null</w:t>
-            </w:r>
-          </w:p>
-          <w:p>
-            <w:pPr>
-              <w:rPr>
-                <w:rFonts w:ascii="Times New Roman" w:hAnsi="Times New Roman" w:cs="Times New Roman"/>
-              </w:rPr>
-            </w:pPr>
-            <w:r>
-              <w:rPr>
-                <w:rFonts w:ascii="Times New Roman" w:hAnsi="Times New Roman" w:cs="Times New Roman"/>
-              </w:rPr>
-              <w:t>Layout atau Absolute Layout</w:t>
+            <w:proofErr w:type="spellStart"/>
+            <w:r>
+              <w:rPr>
+                <w:rFonts w:ascii="Times New Roman" w:hAnsi="Times New Roman" w:cs="Times New Roman"/>
+              </w:rPr>
+              <w:t>Tampilan</w:t>
+            </w:r>
+            <w:proofErr w:type="spellEnd"/>
+            <w:r>
+              <w:rPr>
+                <w:rFonts w:ascii="Times New Roman" w:hAnsi="Times New Roman" w:cs="Times New Roman"/>
+              </w:rPr>
+              <w:t xml:space="preserve"> </w:t>
+            </w:r>
+            <w:proofErr w:type="spellStart"/>
+            <w:r>
+              <w:rPr>
+                <w:rFonts w:ascii="Times New Roman" w:hAnsi="Times New Roman" w:cs="Times New Roman"/>
+              </w:rPr>
+              <w:t>dibuat</w:t>
+            </w:r>
+            <w:proofErr w:type="spellEnd"/>
+            <w:r>
+              <w:rPr>
+                <w:rFonts w:ascii="Times New Roman" w:hAnsi="Times New Roman" w:cs="Times New Roman"/>
+              </w:rPr>
+              <w:t xml:space="preserve"> </w:t>
+            </w:r>
+            <w:proofErr w:type="spellStart"/>
+            <w:r>
+              <w:rPr>
+                <w:rFonts w:ascii="Times New Roman" w:hAnsi="Times New Roman" w:cs="Times New Roman"/>
+              </w:rPr>
+              <w:t>dengan</w:t>
+            </w:r>
+            <w:proofErr w:type="spellEnd"/>
+            <w:r>
+              <w:rPr>
+                <w:rFonts w:ascii="Times New Roman" w:hAnsi="Times New Roman" w:cs="Times New Roman"/>
+              </w:rPr>
+              <w:t xml:space="preserve"> </w:t>
+            </w:r>
+            <w:proofErr w:type="spellStart"/>
+            <w:r>
+              <w:rPr>
+                <w:rFonts w:ascii="Times New Roman" w:hAnsi="Times New Roman" w:cs="Times New Roman"/>
+              </w:rPr>
+              <w:t>JFrame</w:t>
+            </w:r>
+            <w:proofErr w:type="spellEnd"/>
+            <w:r>
+              <w:rPr>
+                <w:rFonts w:ascii="Times New Roman" w:hAnsi="Times New Roman" w:cs="Times New Roman"/>
+              </w:rPr>
+              <w:t xml:space="preserve"> Form dan layout manager, </w:t>
+            </w:r>
+            <w:proofErr w:type="spellStart"/>
+            <w:r>
+              <w:rPr>
+                <w:rFonts w:ascii="Times New Roman" w:hAnsi="Times New Roman" w:cs="Times New Roman"/>
+              </w:rPr>
+              <w:t>bukan</w:t>
+            </w:r>
+            <w:proofErr w:type="spellEnd"/>
+            <w:r>
+              <w:rPr>
+                <w:rFonts w:ascii="Times New Roman" w:hAnsi="Times New Roman" w:cs="Times New Roman"/>
+              </w:rPr>
+              <w:t xml:space="preserve"> Null</w:t>
+            </w:r>
+          </w:p>
+          <w:p>
+            <w:pPr>
+              <w:rPr>
+                <w:rFonts w:ascii="Times New Roman" w:hAnsi="Times New Roman" w:cs="Times New Roman"/>
+              </w:rPr>
+            </w:pPr>
+            <w:r>
+              <w:rPr>
+                <w:rFonts w:ascii="Times New Roman" w:hAnsi="Times New Roman" w:cs="Times New Roman"/>
+              </w:rPr>
+              <w:t xml:space="preserve">Layout </w:t>
+            </w:r>
+            <w:proofErr w:type="spellStart"/>
+            <w:r>
+              <w:rPr>
+                <w:rFonts w:ascii="Times New Roman" w:hAnsi="Times New Roman" w:cs="Times New Roman"/>
+              </w:rPr>
+              <w:t>atau</w:t>
+            </w:r>
+            <w:proofErr w:type="spellEnd"/>
+            <w:r>
+              <w:rPr>
+                <w:rFonts w:ascii="Times New Roman" w:hAnsi="Times New Roman" w:cs="Times New Roman"/>
+              </w:rPr>
+              <w:t xml:space="preserve"> Absolute Layout</w:t>
             </w:r>
           </w:p>
         </w:tc>
@@ -594,6 +1050,7 @@
           <w:rFonts w:ascii="Times New Roman" w:hAnsi="Times New Roman" w:cs="Times New Roman"/>
         </w:rPr>
       </w:pPr>
+      <w:proofErr w:type="gramStart"/>
       <w:r>
         <w:rPr>
           <w:rFonts w:ascii="Times New Roman" w:hAnsi="Times New Roman" w:cs="Times New Roman"/>
@@ -604,25 +1061,270 @@
         <w:rPr>
           <w:rFonts w:ascii="Times New Roman" w:hAnsi="Times New Roman" w:cs="Times New Roman"/>
         </w:rPr>
-        <w:t>: Form nya sudah lumayan rapi tapi s</w:t>
-      </w:r>
-      <w:r>
-        <w:rPr>
-          <w:rFonts w:ascii="Times New Roman" w:hAnsi="Times New Roman" w:cs="Times New Roman"/>
-        </w:rPr>
-        <w:t xml:space="preserve">aat jendela ditinggikan, isi form tetap di atas dan muncul ruang kosong sebelum tombol. </w:t>
-      </w:r>
-      <w:r>
-        <w:rPr>
-          <w:rFonts w:ascii="Times New Roman" w:hAnsi="Times New Roman" w:cs="Times New Roman"/>
-        </w:rPr>
-        <w:t>Bisa be</w:t>
-      </w:r>
-      <w:r>
-        <w:rPr>
-          <w:rFonts w:ascii="Times New Roman" w:hAnsi="Times New Roman" w:cs="Times New Roman"/>
-        </w:rPr>
-        <w:t>ri weight</w:t>
+        <w:t>:</w:t>
+      </w:r>
+      <w:proofErr w:type="gramEnd"/>
+      <w:r>
+        <w:rPr>
+          <w:rFonts w:ascii="Times New Roman" w:hAnsi="Times New Roman" w:cs="Times New Roman"/>
+        </w:rPr>
+        <w:t xml:space="preserve"> Form </w:t>
+      </w:r>
+      <w:proofErr w:type="spellStart"/>
+      <w:r>
+        <w:rPr>
+          <w:rFonts w:ascii="Times New Roman" w:hAnsi="Times New Roman" w:cs="Times New Roman"/>
+        </w:rPr>
+        <w:t>nya</w:t>
+      </w:r>
+      <w:proofErr w:type="spellEnd"/>
+      <w:r>
+        <w:rPr>
+          <w:rFonts w:ascii="Times New Roman" w:hAnsi="Times New Roman" w:cs="Times New Roman"/>
+        </w:rPr>
+        <w:t xml:space="preserve"> </w:t>
+      </w:r>
+      <w:proofErr w:type="spellStart"/>
+      <w:r>
+        <w:rPr>
+          <w:rFonts w:ascii="Times New Roman" w:hAnsi="Times New Roman" w:cs="Times New Roman"/>
+        </w:rPr>
+        <w:t>sudah</w:t>
+      </w:r>
+      <w:proofErr w:type="spellEnd"/>
+      <w:r>
+        <w:rPr>
+          <w:rFonts w:ascii="Times New Roman" w:hAnsi="Times New Roman" w:cs="Times New Roman"/>
+        </w:rPr>
+        <w:t xml:space="preserve"> </w:t>
+      </w:r>
+      <w:proofErr w:type="spellStart"/>
+      <w:r>
+        <w:rPr>
+          <w:rFonts w:ascii="Times New Roman" w:hAnsi="Times New Roman" w:cs="Times New Roman"/>
+        </w:rPr>
+        <w:t>lumayan</w:t>
+      </w:r>
+      <w:proofErr w:type="spellEnd"/>
+      <w:r>
+        <w:rPr>
+          <w:rFonts w:ascii="Times New Roman" w:hAnsi="Times New Roman" w:cs="Times New Roman"/>
+        </w:rPr>
+        <w:t xml:space="preserve"> </w:t>
+      </w:r>
+      <w:proofErr w:type="spellStart"/>
+      <w:r>
+        <w:rPr>
+          <w:rFonts w:ascii="Times New Roman" w:hAnsi="Times New Roman" w:cs="Times New Roman"/>
+        </w:rPr>
+        <w:t>rapi</w:t>
+      </w:r>
+      <w:proofErr w:type="spellEnd"/>
+      <w:r>
+        <w:rPr>
+          <w:rFonts w:ascii="Times New Roman" w:hAnsi="Times New Roman" w:cs="Times New Roman"/>
+        </w:rPr>
+        <w:t xml:space="preserve"> </w:t>
+      </w:r>
+      <w:proofErr w:type="spellStart"/>
+      <w:r>
+        <w:rPr>
+          <w:rFonts w:ascii="Times New Roman" w:hAnsi="Times New Roman" w:cs="Times New Roman"/>
+        </w:rPr>
+        <w:t>tapi</w:t>
+      </w:r>
+      <w:proofErr w:type="spellEnd"/>
+      <w:r>
+        <w:rPr>
+          <w:rFonts w:ascii="Times New Roman" w:hAnsi="Times New Roman" w:cs="Times New Roman"/>
+        </w:rPr>
+        <w:t xml:space="preserve"> </w:t>
+      </w:r>
+      <w:proofErr w:type="spellStart"/>
+      <w:r>
+        <w:rPr>
+          <w:rFonts w:ascii="Times New Roman" w:hAnsi="Times New Roman" w:cs="Times New Roman"/>
+        </w:rPr>
+        <w:t>s</w:t>
+      </w:r>
+      <w:r>
+        <w:rPr>
+          <w:rFonts w:ascii="Times New Roman" w:hAnsi="Times New Roman" w:cs="Times New Roman"/>
+        </w:rPr>
+        <w:t>aat</w:t>
+      </w:r>
+      <w:proofErr w:type="spellEnd"/>
+      <w:r>
+        <w:rPr>
+          <w:rFonts w:ascii="Times New Roman" w:hAnsi="Times New Roman" w:cs="Times New Roman"/>
+        </w:rPr>
+        <w:t xml:space="preserve"> </w:t>
+      </w:r>
+      <w:proofErr w:type="spellStart"/>
+      <w:r>
+        <w:rPr>
+          <w:rFonts w:ascii="Times New Roman" w:hAnsi="Times New Roman" w:cs="Times New Roman"/>
+        </w:rPr>
+        <w:t>jendela</w:t>
+      </w:r>
+      <w:proofErr w:type="spellEnd"/>
+      <w:r>
+        <w:rPr>
+          <w:rFonts w:ascii="Times New Roman" w:hAnsi="Times New Roman" w:cs="Times New Roman"/>
+        </w:rPr>
+        <w:t xml:space="preserve"> </w:t>
+      </w:r>
+      <w:proofErr w:type="spellStart"/>
+      <w:r>
+        <w:rPr>
+          <w:rFonts w:ascii="Times New Roman" w:hAnsi="Times New Roman" w:cs="Times New Roman"/>
+        </w:rPr>
+        <w:t>ditinggikan</w:t>
+      </w:r>
+      <w:proofErr w:type="spellEnd"/>
+      <w:r>
+        <w:rPr>
+          <w:rFonts w:ascii="Times New Roman" w:hAnsi="Times New Roman" w:cs="Times New Roman"/>
+        </w:rPr>
+        <w:t xml:space="preserve">, </w:t>
+      </w:r>
+      <w:proofErr w:type="spellStart"/>
+      <w:r>
+        <w:rPr>
+          <w:rFonts w:ascii="Times New Roman" w:hAnsi="Times New Roman" w:cs="Times New Roman"/>
+        </w:rPr>
+        <w:t>isi</w:t>
+      </w:r>
+      <w:proofErr w:type="spellEnd"/>
+      <w:r>
+        <w:rPr>
+          <w:rFonts w:ascii="Times New Roman" w:hAnsi="Times New Roman" w:cs="Times New Roman"/>
+        </w:rPr>
+        <w:t xml:space="preserve"> form </w:t>
+      </w:r>
+      <w:proofErr w:type="spellStart"/>
+      <w:r>
+        <w:rPr>
+          <w:rFonts w:ascii="Times New Roman" w:hAnsi="Times New Roman" w:cs="Times New Roman"/>
+        </w:rPr>
+        <w:t>tetap</w:t>
+      </w:r>
+      <w:proofErr w:type="spellEnd"/>
+      <w:r>
+        <w:rPr>
+          <w:rFonts w:ascii="Times New Roman" w:hAnsi="Times New Roman" w:cs="Times New Roman"/>
+        </w:rPr>
+        <w:t xml:space="preserve"> di </w:t>
+      </w:r>
+      <w:proofErr w:type="spellStart"/>
+      <w:r>
+        <w:rPr>
+          <w:rFonts w:ascii="Times New Roman" w:hAnsi="Times New Roman" w:cs="Times New Roman"/>
+        </w:rPr>
+        <w:t>atas</w:t>
+      </w:r>
+      <w:proofErr w:type="spellEnd"/>
+      <w:r>
+        <w:rPr>
+          <w:rFonts w:ascii="Times New Roman" w:hAnsi="Times New Roman" w:cs="Times New Roman"/>
+        </w:rPr>
+        <w:t xml:space="preserve"> dan </w:t>
+      </w:r>
+      <w:proofErr w:type="spellStart"/>
+      <w:r>
+        <w:rPr>
+          <w:rFonts w:ascii="Times New Roman" w:hAnsi="Times New Roman" w:cs="Times New Roman"/>
+        </w:rPr>
+        <w:t>muncul</w:t>
+      </w:r>
+      <w:proofErr w:type="spellEnd"/>
+      <w:r>
+        <w:rPr>
+          <w:rFonts w:ascii="Times New Roman" w:hAnsi="Times New Roman" w:cs="Times New Roman"/>
+        </w:rPr>
+        <w:t xml:space="preserve"> </w:t>
+      </w:r>
+      <w:proofErr w:type="spellStart"/>
+      <w:r>
+        <w:rPr>
+          <w:rFonts w:ascii="Times New Roman" w:hAnsi="Times New Roman" w:cs="Times New Roman"/>
+        </w:rPr>
+        <w:t>ruang</w:t>
+      </w:r>
+      <w:proofErr w:type="spellEnd"/>
+      <w:r>
+        <w:rPr>
+          <w:rFonts w:ascii="Times New Roman" w:hAnsi="Times New Roman" w:cs="Times New Roman"/>
+        </w:rPr>
+        <w:t xml:space="preserve"> </w:t>
+      </w:r>
+      <w:proofErr w:type="spellStart"/>
+      <w:r>
+        <w:rPr>
+          <w:rFonts w:ascii="Times New Roman" w:hAnsi="Times New Roman" w:cs="Times New Roman"/>
+        </w:rPr>
+        <w:t>kosong</w:t>
+      </w:r>
+      <w:proofErr w:type="spellEnd"/>
+      <w:r>
+        <w:rPr>
+          <w:rFonts w:ascii="Times New Roman" w:hAnsi="Times New Roman" w:cs="Times New Roman"/>
+        </w:rPr>
+        <w:t xml:space="preserve"> </w:t>
+      </w:r>
+      <w:proofErr w:type="spellStart"/>
+      <w:r>
+        <w:rPr>
+          <w:rFonts w:ascii="Times New Roman" w:hAnsi="Times New Roman" w:cs="Times New Roman"/>
+        </w:rPr>
+        <w:t>sebelum</w:t>
+      </w:r>
+      <w:proofErr w:type="spellEnd"/>
+      <w:r>
+        <w:rPr>
+          <w:rFonts w:ascii="Times New Roman" w:hAnsi="Times New Roman" w:cs="Times New Roman"/>
+        </w:rPr>
+        <w:t xml:space="preserve"> </w:t>
+      </w:r>
+      <w:proofErr w:type="spellStart"/>
+      <w:r>
+        <w:rPr>
+          <w:rFonts w:ascii="Times New Roman" w:hAnsi="Times New Roman" w:cs="Times New Roman"/>
+        </w:rPr>
+        <w:t>tombol</w:t>
+      </w:r>
+      <w:proofErr w:type="spellEnd"/>
+      <w:r>
+        <w:rPr>
+          <w:rFonts w:ascii="Times New Roman" w:hAnsi="Times New Roman" w:cs="Times New Roman"/>
+        </w:rPr>
+        <w:t xml:space="preserve">. </w:t>
+      </w:r>
+      <w:r>
+        <w:rPr>
+          <w:rFonts w:ascii="Times New Roman" w:hAnsi="Times New Roman" w:cs="Times New Roman"/>
+        </w:rPr>
+        <w:t xml:space="preserve">Bisa </w:t>
+      </w:r>
+      <w:proofErr w:type="spellStart"/>
+      <w:r>
+        <w:rPr>
+          <w:rFonts w:ascii="Times New Roman" w:hAnsi="Times New Roman" w:cs="Times New Roman"/>
+        </w:rPr>
+        <w:t>be</w:t>
+      </w:r>
+      <w:r>
+        <w:rPr>
+          <w:rFonts w:ascii="Times New Roman" w:hAnsi="Times New Roman" w:cs="Times New Roman"/>
+        </w:rPr>
+        <w:t>ri</w:t>
+      </w:r>
+      <w:proofErr w:type="spellEnd"/>
+      <w:r>
+        <w:rPr>
+          <w:rFonts w:ascii="Times New Roman" w:hAnsi="Times New Roman" w:cs="Times New Roman"/>
+        </w:rPr>
+        <w:t xml:space="preserve"> weight</w:t>
       </w:r>
       <w:r>
         <w:rPr>
@@ -634,8 +1336,23 @@
         <w:rPr>
           <w:rFonts w:ascii="Times New Roman" w:hAnsi="Times New Roman" w:cs="Times New Roman"/>
         </w:rPr>
-        <w:t xml:space="preserve"> 1.0 dan fill BOTH pada kolom </w:t>
-      </w:r>
+        <w:t xml:space="preserve"> 1.0 dan fill BOTH pada </w:t>
+      </w:r>
+      <w:proofErr w:type="spellStart"/>
+      <w:r>
+        <w:rPr>
+          <w:rFonts w:ascii="Times New Roman" w:hAnsi="Times New Roman" w:cs="Times New Roman"/>
+        </w:rPr>
+        <w:t>kolom</w:t>
+      </w:r>
+      <w:proofErr w:type="spellEnd"/>
+      <w:r>
+        <w:rPr>
+          <w:rFonts w:ascii="Times New Roman" w:hAnsi="Times New Roman" w:cs="Times New Roman"/>
+        </w:rPr>
+        <w:t xml:space="preserve"> </w:t>
+      </w:r>
+      <w:proofErr w:type="spellStart"/>
       <w:r>
         <w:rPr>
           <w:rFonts w:ascii="Times New Roman" w:hAnsi="Times New Roman" w:cs="Times New Roman"/>
@@ -646,7 +1363,98 @@
         <w:rPr>
           <w:rFonts w:ascii="Times New Roman" w:hAnsi="Times New Roman" w:cs="Times New Roman"/>
         </w:rPr>
-        <w:t>lamat, lalu pindahkan formPanel ke CENTER agar Alamat ikut memanjang.</w:t>
+        <w:t>lamat</w:t>
+      </w:r>
+      <w:proofErr w:type="spellEnd"/>
+      <w:r>
+        <w:rPr>
+          <w:rFonts w:ascii="Times New Roman" w:hAnsi="Times New Roman" w:cs="Times New Roman"/>
+        </w:rPr>
+        <w:t xml:space="preserve">, </w:t>
+      </w:r>
+      <w:proofErr w:type="spellStart"/>
+      <w:r>
+        <w:rPr>
+          <w:rFonts w:ascii="Times New Roman" w:hAnsi="Times New Roman" w:cs="Times New Roman"/>
+        </w:rPr>
+        <w:t>lalu</w:t>
+      </w:r>
+      <w:proofErr w:type="spellEnd"/>
+      <w:r>
+        <w:rPr>
+          <w:rFonts w:ascii="Times New Roman" w:hAnsi="Times New Roman" w:cs="Times New Roman"/>
+        </w:rPr>
+        <w:t xml:space="preserve"> </w:t>
+      </w:r>
+      <w:proofErr w:type="spellStart"/>
+      <w:r>
+        <w:rPr>
+          <w:rFonts w:ascii="Times New Roman" w:hAnsi="Times New Roman" w:cs="Times New Roman"/>
+        </w:rPr>
+        <w:t>pindahkan</w:t>
+      </w:r>
+      <w:proofErr w:type="spellEnd"/>
+      <w:r>
+        <w:rPr>
+          <w:rFonts w:ascii="Times New Roman" w:hAnsi="Times New Roman" w:cs="Times New Roman"/>
+        </w:rPr>
+        <w:t xml:space="preserve"> </w:t>
+      </w:r>
+      <w:proofErr w:type="spellStart"/>
+      <w:r>
+        <w:rPr>
+          <w:rFonts w:ascii="Times New Roman" w:hAnsi="Times New Roman" w:cs="Times New Roman"/>
+        </w:rPr>
+        <w:t>formPanel</w:t>
+      </w:r>
+      <w:proofErr w:type="spellEnd"/>
+      <w:r>
+        <w:rPr>
+          <w:rFonts w:ascii="Times New Roman" w:hAnsi="Times New Roman" w:cs="Times New Roman"/>
+        </w:rPr>
+        <w:t xml:space="preserve"> </w:t>
+      </w:r>
+      <w:proofErr w:type="spellStart"/>
+      <w:r>
+        <w:rPr>
+          <w:rFonts w:ascii="Times New Roman" w:hAnsi="Times New Roman" w:cs="Times New Roman"/>
+        </w:rPr>
+        <w:t>ke</w:t>
+      </w:r>
+      <w:proofErr w:type="spellEnd"/>
+      <w:r>
+        <w:rPr>
+          <w:rFonts w:ascii="Times New Roman" w:hAnsi="Times New Roman" w:cs="Times New Roman"/>
+        </w:rPr>
+        <w:t xml:space="preserve"> CENTER agar Alamat </w:t>
+      </w:r>
+      <w:proofErr w:type="spellStart"/>
+      <w:r>
+        <w:rPr>
+          <w:rFonts w:ascii="Times New Roman" w:hAnsi="Times New Roman" w:cs="Times New Roman"/>
+        </w:rPr>
+        <w:t>ikut</w:t>
+      </w:r>
+      <w:proofErr w:type="spellEnd"/>
+      <w:r>
+        <w:rPr>
+          <w:rFonts w:ascii="Times New Roman" w:hAnsi="Times New Roman" w:cs="Times New Roman"/>
+        </w:rPr>
+        <w:t xml:space="preserve"> </w:t>
+      </w:r>
+      <w:proofErr w:type="spellStart"/>
+      <w:r>
+        <w:rPr>
+          <w:rFonts w:ascii="Times New Roman" w:hAnsi="Times New Roman" w:cs="Times New Roman"/>
+        </w:rPr>
+        <w:t>memanjang</w:t>
+      </w:r>
+      <w:proofErr w:type="spellEnd"/>
+      <w:r>
+        <w:rPr>
+          <w:rFonts w:ascii="Times New Roman" w:hAnsi="Times New Roman" w:cs="Times New Roman"/>
+        </w:rPr>
+        <w:t>.</w:t>
       </w:r>
     </w:p>
     <w:p>
@@ -662,12 +1470,36 @@
           <w:rFonts w:ascii="Times New Roman" w:hAnsi="Times New Roman" w:cs="Times New Roman"/>
         </w:rPr>
       </w:pPr>
-      <w:r>
-        <w:rPr>
-          <w:rFonts w:ascii="Times New Roman" w:hAnsi="Times New Roman" w:cs="Times New Roman"/>
-        </w:rPr>
-        <w:t>Penilaian Teman dari :</w:t>
-      </w:r>
+      <w:proofErr w:type="spellStart"/>
+      <w:r>
+        <w:rPr>
+          <w:rFonts w:ascii="Times New Roman" w:hAnsi="Times New Roman" w:cs="Times New Roman"/>
+        </w:rPr>
+        <w:t>Penilaian</w:t>
+      </w:r>
+      <w:proofErr w:type="spellEnd"/>
+      <w:r>
+        <w:rPr>
+          <w:rFonts w:ascii="Times New Roman" w:hAnsi="Times New Roman" w:cs="Times New Roman"/>
+        </w:rPr>
+        <w:t xml:space="preserve"> Teman </w:t>
+      </w:r>
+      <w:proofErr w:type="spellStart"/>
+      <w:proofErr w:type="gramStart"/>
+      <w:r>
+        <w:rPr>
+          <w:rFonts w:ascii="Times New Roman" w:hAnsi="Times New Roman" w:cs="Times New Roman"/>
+        </w:rPr>
+        <w:t>dari</w:t>
+      </w:r>
+      <w:proofErr w:type="spellEnd"/>
+      <w:r>
+        <w:rPr>
+          <w:rFonts w:ascii="Times New Roman" w:hAnsi="Times New Roman" w:cs="Times New Roman"/>
+        </w:rPr>
+        <w:t xml:space="preserve"> :</w:t>
+      </w:r>
+      <w:proofErr w:type="gramEnd"/>
     </w:p>
     <w:p>
       <w:pPr>
@@ -699,6 +1531,488 @@
         </w:rPr>
         <w:t>140</w:t>
       </w:r>
+    </w:p>
+    <w:p>
+      <w:pPr>
+        <w:rPr>
+          <w:rFonts w:ascii="Times New Roman" w:hAnsi="Times New Roman" w:cs="Times New Roman"/>
+        </w:rPr>
+      </w:pPr>
+      <w:r>
+        <w:rPr>
+          <w:rFonts w:ascii="Times New Roman" w:hAnsi="Times New Roman" w:cs="Times New Roman"/>
+        </w:rPr>
+        <w:br w:type="page"/>
+      </w:r>
+    </w:p>
+    <w:tbl>
+      <w:tblPr>
+        <w:tblStyle w:val="TableGrid"/>
+        <w:tblW w:w="0" w:type="auto"/>
+        <w:tblLook w:val="04A0" w:firstRow="1" w:lastRow="0" w:firstColumn="1" w:lastColumn="0" w:noHBand="0" w:noVBand="1"/>
+      </w:tblPr>
+      <w:tblGrid>
+        <w:gridCol w:w="1555"/>
+        <w:gridCol w:w="4509"/>
+        <w:gridCol w:w="3286"/>
+      </w:tblGrid>
+      <w:tr>
+        <w:tc>
+          <w:tcPr>
+            <w:tcW w:w="1555" w:type="dxa"/>
+          </w:tcPr>
+          <w:p>
+            <w:pPr>
+              <w:rPr>
+                <w:rFonts w:ascii="Times New Roman" w:hAnsi="Times New Roman" w:cs="Times New Roman"/>
+              </w:rPr>
+            </w:pPr>
+            <w:r>
+              <w:rPr>
+                <w:rFonts w:ascii="Times New Roman" w:hAnsi="Times New Roman" w:cs="Times New Roman"/>
+              </w:rPr>
+              <w:lastRenderedPageBreak/>
+              <w:t>Bagian</w:t>
+            </w:r>
+          </w:p>
+        </w:tc>
+        <w:tc>
+          <w:tcPr>
+            <w:tcW w:w="4509" w:type="dxa"/>
+          </w:tcPr>
+          <w:p>
+            <w:pPr>
+              <w:rPr>
+                <w:rFonts w:ascii="Times New Roman" w:hAnsi="Times New Roman" w:cs="Times New Roman"/>
+              </w:rPr>
+            </w:pPr>
+            <w:r>
+              <w:rPr>
+                <w:rFonts w:ascii="Times New Roman" w:hAnsi="Times New Roman" w:cs="Times New Roman"/>
+              </w:rPr>
+              <w:t>Panel</w:t>
+            </w:r>
+          </w:p>
+        </w:tc>
+        <w:tc>
+          <w:tcPr>
+            <w:tcW w:w="3286" w:type="dxa"/>
+          </w:tcPr>
+          <w:p>
+            <w:pPr>
+              <w:rPr>
+                <w:rFonts w:ascii="Times New Roman" w:hAnsi="Times New Roman" w:cs="Times New Roman"/>
+              </w:rPr>
+            </w:pPr>
+            <w:r>
+              <w:rPr>
+                <w:rFonts w:ascii="Times New Roman" w:hAnsi="Times New Roman" w:cs="Times New Roman"/>
+              </w:rPr>
+              <w:t>Layout</w:t>
+            </w:r>
+          </w:p>
+        </w:tc>
+      </w:tr>
+      <w:tr>
+        <w:tc>
+          <w:tcPr>
+            <w:tcW w:w="1555" w:type="dxa"/>
+          </w:tcPr>
+          <w:p>
+            <w:pPr>
+              <w:rPr>
+                <w:rFonts w:ascii="Times New Roman" w:hAnsi="Times New Roman" w:cs="Times New Roman"/>
+              </w:rPr>
+            </w:pPr>
+            <w:proofErr w:type="spellStart"/>
+            <w:r>
+              <w:rPr>
+                <w:rFonts w:ascii="Times New Roman" w:hAnsi="Times New Roman" w:cs="Times New Roman"/>
+              </w:rPr>
+              <w:t>Jendela</w:t>
+            </w:r>
+            <w:proofErr w:type="spellEnd"/>
+            <w:r>
+              <w:rPr>
+                <w:rFonts w:ascii="Times New Roman" w:hAnsi="Times New Roman" w:cs="Times New Roman"/>
+              </w:rPr>
+              <w:t xml:space="preserve"> </w:t>
+            </w:r>
+          </w:p>
+        </w:tc>
+        <w:tc>
+          <w:tcPr>
+            <w:tcW w:w="4509" w:type="dxa"/>
+          </w:tcPr>
+          <w:p>
+            <w:pPr>
+              <w:rPr>
+                <w:rFonts w:ascii="Times New Roman" w:hAnsi="Times New Roman" w:cs="Times New Roman"/>
+              </w:rPr>
+            </w:pPr>
+            <w:proofErr w:type="spellStart"/>
+            <w:r>
+              <w:rPr>
+                <w:rFonts w:ascii="Times New Roman" w:hAnsi="Times New Roman" w:cs="Times New Roman"/>
+              </w:rPr>
+              <w:t>JFrame</w:t>
+            </w:r>
+            <w:proofErr w:type="spellEnd"/>
+            <w:r>
+              <w:rPr>
+                <w:rFonts w:ascii="Times New Roman" w:hAnsi="Times New Roman" w:cs="Times New Roman"/>
+              </w:rPr>
+              <w:t xml:space="preserve">                                          </w:t>
+            </w:r>
+          </w:p>
+        </w:tc>
+        <w:tc>
+          <w:tcPr>
+            <w:tcW w:w="3286" w:type="dxa"/>
+          </w:tcPr>
+          <w:p>
+            <w:pPr>
+              <w:rPr>
+                <w:rFonts w:ascii="Times New Roman" w:hAnsi="Times New Roman" w:cs="Times New Roman"/>
+              </w:rPr>
+            </w:pPr>
+            <w:proofErr w:type="spellStart"/>
+            <w:r>
+              <w:rPr>
+                <w:rFonts w:ascii="Times New Roman" w:hAnsi="Times New Roman" w:cs="Times New Roman"/>
+              </w:rPr>
+              <w:t>BorderLayout</w:t>
+            </w:r>
+            <w:proofErr w:type="spellEnd"/>
+          </w:p>
+        </w:tc>
+      </w:tr>
+      <w:tr>
+        <w:tc>
+          <w:tcPr>
+            <w:tcW w:w="1555" w:type="dxa"/>
+          </w:tcPr>
+          <w:p>
+            <w:pPr>
+              <w:rPr>
+                <w:rFonts w:ascii="Times New Roman" w:hAnsi="Times New Roman" w:cs="Times New Roman"/>
+              </w:rPr>
+            </w:pPr>
+            <w:r>
+              <w:rPr>
+                <w:rFonts w:ascii="Times New Roman" w:hAnsi="Times New Roman" w:cs="Times New Roman"/>
+              </w:rPr>
+              <w:t>Header </w:t>
+            </w:r>
+          </w:p>
+        </w:tc>
+        <w:tc>
+          <w:tcPr>
+            <w:tcW w:w="4509" w:type="dxa"/>
+          </w:tcPr>
+          <w:p>
+            <w:pPr>
+              <w:rPr>
+                <w:rFonts w:ascii="Times New Roman" w:hAnsi="Times New Roman" w:cs="Times New Roman"/>
+              </w:rPr>
+            </w:pPr>
+            <w:r>
+              <w:rPr>
+                <w:rFonts w:ascii="Times New Roman" w:hAnsi="Times New Roman" w:cs="Times New Roman"/>
+              </w:rPr>
+              <w:t>`</w:t>
+            </w:r>
+            <w:proofErr w:type="spellStart"/>
+            <w:r>
+              <w:rPr>
+                <w:rFonts w:ascii="Times New Roman" w:hAnsi="Times New Roman" w:cs="Times New Roman"/>
+              </w:rPr>
+              <w:t>headerPanel</w:t>
+            </w:r>
+            <w:proofErr w:type="spellEnd"/>
+            <w:r>
+              <w:rPr>
+                <w:rFonts w:ascii="Times New Roman" w:hAnsi="Times New Roman" w:cs="Times New Roman"/>
+              </w:rPr>
+              <w:t>` (North)  </w:t>
+            </w:r>
+          </w:p>
+        </w:tc>
+        <w:tc>
+          <w:tcPr>
+            <w:tcW w:w="3286" w:type="dxa"/>
+          </w:tcPr>
+          <w:p>
+            <w:pPr>
+              <w:rPr>
+                <w:rFonts w:ascii="Times New Roman" w:hAnsi="Times New Roman" w:cs="Times New Roman"/>
+              </w:rPr>
+            </w:pPr>
+            <w:proofErr w:type="spellStart"/>
+            <w:r>
+              <w:rPr>
+                <w:rFonts w:ascii="Times New Roman" w:hAnsi="Times New Roman" w:cs="Times New Roman"/>
+              </w:rPr>
+              <w:t>BoxLayout</w:t>
+            </w:r>
+            <w:proofErr w:type="spellEnd"/>
+            <w:r>
+              <w:rPr>
+                <w:rFonts w:ascii="Times New Roman" w:hAnsi="Times New Roman" w:cs="Times New Roman"/>
+              </w:rPr>
+              <w:t>, Y Axis  </w:t>
+            </w:r>
+          </w:p>
+        </w:tc>
+      </w:tr>
+      <w:tr>
+        <w:tc>
+          <w:tcPr>
+            <w:tcW w:w="1555" w:type="dxa"/>
+          </w:tcPr>
+          <w:p>
+            <w:pPr>
+              <w:rPr>
+                <w:rFonts w:ascii="Times New Roman" w:hAnsi="Times New Roman" w:cs="Times New Roman"/>
+              </w:rPr>
+            </w:pPr>
+            <w:r>
+              <w:rPr>
+                <w:rFonts w:ascii="Times New Roman" w:hAnsi="Times New Roman" w:cs="Times New Roman"/>
+              </w:rPr>
+              <w:t xml:space="preserve">Isi form </w:t>
+            </w:r>
+          </w:p>
+        </w:tc>
+        <w:tc>
+          <w:tcPr>
+            <w:tcW w:w="4509" w:type="dxa"/>
+          </w:tcPr>
+          <w:p>
+            <w:pPr>
+              <w:rPr>
+                <w:rFonts w:ascii="Times New Roman" w:hAnsi="Times New Roman" w:cs="Times New Roman"/>
+              </w:rPr>
+            </w:pPr>
+            <w:r>
+              <w:rPr>
+                <w:rFonts w:ascii="Times New Roman" w:hAnsi="Times New Roman" w:cs="Times New Roman"/>
+              </w:rPr>
+              <w:t>`</w:t>
+            </w:r>
+            <w:proofErr w:type="spellStart"/>
+            <w:r>
+              <w:rPr>
+                <w:rFonts w:ascii="Times New Roman" w:hAnsi="Times New Roman" w:cs="Times New Roman"/>
+              </w:rPr>
+              <w:t>isiPanel</w:t>
+            </w:r>
+            <w:proofErr w:type="spellEnd"/>
+            <w:r>
+              <w:rPr>
+                <w:rFonts w:ascii="Times New Roman" w:hAnsi="Times New Roman" w:cs="Times New Roman"/>
+              </w:rPr>
+              <w:t xml:space="preserve">` (Center), </w:t>
+            </w:r>
+            <w:proofErr w:type="spellStart"/>
+            <w:r>
+              <w:rPr>
+                <w:rFonts w:ascii="Times New Roman" w:hAnsi="Times New Roman" w:cs="Times New Roman"/>
+              </w:rPr>
+              <w:t>berisi</w:t>
+            </w:r>
+            <w:proofErr w:type="spellEnd"/>
+            <w:r>
+              <w:rPr>
+                <w:rFonts w:ascii="Times New Roman" w:hAnsi="Times New Roman" w:cs="Times New Roman"/>
+              </w:rPr>
+              <w:t xml:space="preserve"> `</w:t>
+            </w:r>
+            <w:proofErr w:type="spellStart"/>
+            <w:r>
+              <w:rPr>
+                <w:rFonts w:ascii="Times New Roman" w:hAnsi="Times New Roman" w:cs="Times New Roman"/>
+              </w:rPr>
+              <w:t>formPanel</w:t>
+            </w:r>
+            <w:proofErr w:type="spellEnd"/>
+            <w:r>
+              <w:rPr>
+                <w:rFonts w:ascii="Times New Roman" w:hAnsi="Times New Roman" w:cs="Times New Roman"/>
+              </w:rPr>
+              <w:t>` (North)</w:t>
+            </w:r>
+          </w:p>
+        </w:tc>
+        <w:tc>
+          <w:tcPr>
+            <w:tcW w:w="3286" w:type="dxa"/>
+          </w:tcPr>
+          <w:p>
+            <w:pPr>
+              <w:rPr>
+                <w:rFonts w:ascii="Times New Roman" w:hAnsi="Times New Roman" w:cs="Times New Roman"/>
+              </w:rPr>
+            </w:pPr>
+            <w:r>
+              <w:rPr>
+                <w:rFonts w:ascii="Times New Roman" w:hAnsi="Times New Roman" w:cs="Times New Roman"/>
+              </w:rPr>
+              <w:t>`</w:t>
+            </w:r>
+            <w:proofErr w:type="spellStart"/>
+            <w:r>
+              <w:rPr>
+                <w:rFonts w:ascii="Times New Roman" w:hAnsi="Times New Roman" w:cs="Times New Roman"/>
+              </w:rPr>
+              <w:t>isiPanel</w:t>
+            </w:r>
+            <w:proofErr w:type="spellEnd"/>
+            <w:r>
+              <w:rPr>
+                <w:rFonts w:ascii="Times New Roman" w:hAnsi="Times New Roman" w:cs="Times New Roman"/>
+              </w:rPr>
+              <w:t xml:space="preserve">`: </w:t>
+            </w:r>
+            <w:proofErr w:type="spellStart"/>
+            <w:r>
+              <w:rPr>
+                <w:rFonts w:ascii="Times New Roman" w:hAnsi="Times New Roman" w:cs="Times New Roman"/>
+              </w:rPr>
+              <w:t>BorderLayout</w:t>
+            </w:r>
+            <w:proofErr w:type="spellEnd"/>
+            <w:r>
+              <w:rPr>
+                <w:rFonts w:ascii="Times New Roman" w:hAnsi="Times New Roman" w:cs="Times New Roman"/>
+              </w:rPr>
+              <w:t>; `</w:t>
+            </w:r>
+            <w:proofErr w:type="spellStart"/>
+            <w:r>
+              <w:rPr>
+                <w:rFonts w:ascii="Times New Roman" w:hAnsi="Times New Roman" w:cs="Times New Roman"/>
+              </w:rPr>
+              <w:t>formPanel</w:t>
+            </w:r>
+            <w:proofErr w:type="spellEnd"/>
+            <w:r>
+              <w:rPr>
+                <w:rFonts w:ascii="Times New Roman" w:hAnsi="Times New Roman" w:cs="Times New Roman"/>
+              </w:rPr>
+              <w:t>`:</w:t>
+            </w:r>
+            <w:r>
+              <w:rPr>
+                <w:rFonts w:ascii="Times New Roman" w:hAnsi="Times New Roman" w:cs="Times New Roman"/>
+              </w:rPr>
+              <w:t xml:space="preserve"> </w:t>
+            </w:r>
+            <w:proofErr w:type="spellStart"/>
+            <w:r>
+              <w:rPr>
+                <w:rFonts w:ascii="Times New Roman" w:hAnsi="Times New Roman" w:cs="Times New Roman"/>
+              </w:rPr>
+              <w:t>GridBagLayout</w:t>
+            </w:r>
+            <w:proofErr w:type="spellEnd"/>
+          </w:p>
+        </w:tc>
+      </w:tr>
+      <w:tr>
+        <w:tc>
+          <w:tcPr>
+            <w:tcW w:w="1555" w:type="dxa"/>
+          </w:tcPr>
+          <w:p>
+            <w:pPr>
+              <w:rPr>
+                <w:rFonts w:ascii="Times New Roman" w:hAnsi="Times New Roman" w:cs="Times New Roman"/>
+              </w:rPr>
+            </w:pPr>
+            <w:proofErr w:type="spellStart"/>
+            <w:r>
+              <w:rPr>
+                <w:rFonts w:ascii="Times New Roman" w:hAnsi="Times New Roman" w:cs="Times New Roman"/>
+              </w:rPr>
+              <w:t>Tombol</w:t>
+            </w:r>
+            <w:proofErr w:type="spellEnd"/>
+          </w:p>
+        </w:tc>
+        <w:tc>
+          <w:tcPr>
+            <w:tcW w:w="4509" w:type="dxa"/>
+          </w:tcPr>
+          <w:p>
+            <w:pPr>
+              <w:rPr>
+                <w:rFonts w:ascii="Times New Roman" w:hAnsi="Times New Roman" w:cs="Times New Roman"/>
+              </w:rPr>
+            </w:pPr>
+            <w:r>
+              <w:rPr>
+                <w:rFonts w:ascii="Times New Roman" w:hAnsi="Times New Roman" w:cs="Times New Roman"/>
+              </w:rPr>
+              <w:t>`</w:t>
+            </w:r>
+            <w:proofErr w:type="spellStart"/>
+            <w:r>
+              <w:rPr>
+                <w:rFonts w:ascii="Times New Roman" w:hAnsi="Times New Roman" w:cs="Times New Roman"/>
+              </w:rPr>
+              <w:t>tombolPanel</w:t>
+            </w:r>
+            <w:proofErr w:type="spellEnd"/>
+            <w:r>
+              <w:rPr>
+                <w:rFonts w:ascii="Times New Roman" w:hAnsi="Times New Roman" w:cs="Times New Roman"/>
+              </w:rPr>
+              <w:t xml:space="preserve">` (South) </w:t>
+            </w:r>
+          </w:p>
+        </w:tc>
+        <w:tc>
+          <w:tcPr>
+            <w:tcW w:w="3286" w:type="dxa"/>
+          </w:tcPr>
+          <w:p>
+            <w:pPr>
+              <w:rPr>
+                <w:rFonts w:ascii="Times New Roman" w:hAnsi="Times New Roman" w:cs="Times New Roman"/>
+              </w:rPr>
+            </w:pPr>
+            <w:proofErr w:type="spellStart"/>
+            <w:r>
+              <w:rPr>
+                <w:rFonts w:ascii="Times New Roman" w:hAnsi="Times New Roman" w:cs="Times New Roman"/>
+              </w:rPr>
+              <w:t>FlowLayout</w:t>
+            </w:r>
+            <w:proofErr w:type="spellEnd"/>
+            <w:r>
+              <w:rPr>
+                <w:rFonts w:ascii="Times New Roman" w:hAnsi="Times New Roman" w:cs="Times New Roman"/>
+              </w:rPr>
+              <w:t xml:space="preserve">, Alignment Right </w:t>
+            </w:r>
+          </w:p>
+        </w:tc>
+      </w:tr>
+    </w:tbl>
+    <w:p>
+      <w:pPr>
+        <w:rPr>
+          <w:rFonts w:ascii="Times New Roman" w:hAnsi="Times New Roman" w:cs="Times New Roman"/>
+        </w:rPr>
+      </w:pPr>
+    </w:p>
+    <w:p>
+      <w:pPr>
+        <w:rPr>
+          <w:rFonts w:ascii="Times New Roman" w:hAnsi="Times New Roman" w:cs="Times New Roman"/>
+        </w:rPr>
+      </w:pPr>
     </w:p>
     <w:sectPr>
       <w:pgSz w:w="12240" w:h="15840"/>
@@ -1410,7 +2724,6 @@
   <w:style w:type="character" w:default="1" w:styleId="DefaultParagraphFont">
     <w:name w:val="Default Paragraph Font"/>
     <w:uiPriority w:val="1"/>
-    <w:semiHidden/>
     <w:unhideWhenUsed/>
   </w:style>
   <w:style w:type="table" w:default="1" w:styleId="TableNormal">

</xml_diff>